<commit_message>
feat(contracts): month-to-month retainer authoring (FluffCo + Zenwise) + optional performance tiers
- mtm-retainer.js: authors MTM custom-package retainers (no Rounds commitment,
  no Appendix A); FluffCo and Zenwise configs share one legal text source.
  Whitelisting lives in T&C 3.2 only; flat-rate tiers on monthly ad spend on
  Krave-provided creatives (Noa 2026-06-12).
- generate-contract.js/template: performanceTiers now optional for custom deals
  (fixed-fee), terminationNotice override for T&C 5.1; template rebuilt (both
  copies). Skill docs + README synced (.claude + .agents).
- templates/: add Krave Media x Zenwise source docx.

Co-Authored-By: Claude Fable 5 <noreply@anthropic.com>
</commit_message>
<xml_diff>
--- a/projects/contract-generation/template/retainer-template.docx
+++ b/projects/contract-generation/template/retainer-template.docx
@@ -304,6 +304,14 @@
     </w:p>
     <w:p>
       <w:pPr>
+        <w:spacing w:after="0"/>
+      </w:pPr>
+      <w:r>
+        <w:t xml:space="preserve">{#deliverables}</w:t>
+      </w:r>
+    </w:p>
+    <w:p>
+      <w:pPr>
         <w:pStyle w:val="ListParagraph"/>
         <w:numPr>
           <w:ilvl w:val="0"/>
@@ -312,7 +320,23 @@
         <w:spacing w:after="40"/>
       </w:pPr>
       <w:r>
-        <w:t xml:space="preserve">{#deliverables}{item}{/deliverables}</w:t>
+        <w:t xml:space="preserve">{item}</w:t>
+      </w:r>
+    </w:p>
+    <w:p>
+      <w:pPr>
+        <w:spacing w:after="0"/>
+      </w:pPr>
+      <w:r>
+        <w:t xml:space="preserve">{/deliverables}</w:t>
+      </w:r>
+    </w:p>
+    <w:p>
+      <w:pPr>
+        <w:spacing w:after="0"/>
+      </w:pPr>
+      <w:r>
+        <w:t xml:space="preserve">{#hasPerformanceTiers}</w:t>
       </w:r>
     </w:p>
     <w:p>
@@ -321,6 +345,14 @@
       </w:pPr>
       <w:r>
         <w:t xml:space="preserve">Performance Incentives apply as follows:</w:t>
+      </w:r>
+    </w:p>
+    <w:p>
+      <w:pPr>
+        <w:spacing w:after="0"/>
+      </w:pPr>
+      <w:r>
+        <w:t xml:space="preserve">{#performanceTiers}</w:t>
       </w:r>
     </w:p>
     <w:p>
@@ -333,7 +365,31 @@
         <w:spacing w:after="40"/>
       </w:pPr>
       <w:r>
-        <w:t xml:space="preserve">{#performanceTiers}{metric} — Target {target} — {fee}{/performanceTiers}</w:t>
+        <w:t xml:space="preserve">{metric} — {target} — {fee}</w:t>
+      </w:r>
+    </w:p>
+    <w:p>
+      <w:pPr>
+        <w:spacing w:after="0"/>
+      </w:pPr>
+      <w:r>
+        <w:t xml:space="preserve">{/performanceTiers}</w:t>
+      </w:r>
+    </w:p>
+    <w:p>
+      <w:pPr>
+        <w:spacing w:after="120"/>
+      </w:pPr>
+      <w:r>
+        <w:t xml:space="preserve">Performance-based fees are calculated on a flat-rate basis (the rate of the tier in which the applicable month’s total falls applies to the full amount) and shall be payable only to the extent that such fees exceed the monthly base fee in the applicable month.</w:t>
+      </w:r>
+    </w:p>
+    <w:p>
+      <w:pPr>
+        <w:spacing w:after="0"/>
+      </w:pPr>
+      <w:r>
+        <w:t xml:space="preserve">{/hasPerformanceTiers}</w:t>
       </w:r>
     </w:p>
     <w:p>
@@ -817,7 +873,7 @@
         <w:t xml:space="preserve">5.1 Termination for Convenience: </w:t>
       </w:r>
       <w:r>
-        <w:t xml:space="preserve">Either party may terminate this Agreement at any time, for any reason, with thirty (30) days’ written notice.</w:t>
+        <w:t xml:space="preserve">Either party may terminate this Agreement at any time, for any reason, with {terminationNotice} written notice.</w:t>
       </w:r>
     </w:p>
     <w:p>

</xml_diff>